<commit_message>
Finishing off mini activities for KM02
</commit_message>
<xml_diff>
--- a/PM-02/Mini Activities/evidence/KM02 -  Mini Activities.docx
+++ b/PM-02/Mini Activities/evidence/KM02 -  Mini Activities.docx
@@ -240,6 +240,7 @@
         <w:pStyle w:val="Heading1"/>
       </w:pPr>
       <w:r>
+        <w:lastRenderedPageBreak/>
         <w:t>Topic 2 – Mini Activity:</w:t>
       </w:r>
     </w:p>
@@ -528,6 +529,7 @@
         <w:pStyle w:val="Heading1"/>
       </w:pPr>
       <w:r>
+        <w:lastRenderedPageBreak/>
         <w:t>Topic 4 - Mini Activity:</w:t>
       </w:r>
     </w:p>
@@ -675,7 +677,911 @@
         <w:t>Topic 5 - Mini Activity:</w:t>
       </w:r>
     </w:p>
-    <w:p/>
+    <w:p>
+      <w:r>
+        <w:rPr>
+          <w:noProof/>
+        </w:rPr>
+        <w:drawing>
+          <wp:inline distT="0" distB="0" distL="0" distR="0" wp14:anchorId="6F123E8C" wp14:editId="26B641AF">
+            <wp:extent cx="5731510" cy="1000760"/>
+            <wp:effectExtent l="0" t="0" r="2540" b="8890"/>
+            <wp:docPr id="1361457512" name="Picture 1"/>
+            <wp:cNvGraphicFramePr>
+              <a:graphicFrameLocks xmlns:a="http://schemas.openxmlformats.org/drawingml/2006/main" noChangeAspect="1"/>
+            </wp:cNvGraphicFramePr>
+            <a:graphic xmlns:a="http://schemas.openxmlformats.org/drawingml/2006/main">
+              <a:graphicData uri="http://schemas.openxmlformats.org/drawingml/2006/picture">
+                <pic:pic xmlns:pic="http://schemas.openxmlformats.org/drawingml/2006/picture">
+                  <pic:nvPicPr>
+                    <pic:cNvPr id="1361457512" name=""/>
+                    <pic:cNvPicPr/>
+                  </pic:nvPicPr>
+                  <pic:blipFill>
+                    <a:blip r:embed="rId18"/>
+                    <a:stretch>
+                      <a:fillRect/>
+                    </a:stretch>
+                  </pic:blipFill>
+                  <pic:spPr>
+                    <a:xfrm>
+                      <a:off x="0" y="0"/>
+                      <a:ext cx="5731510" cy="1000760"/>
+                    </a:xfrm>
+                    <a:prstGeom prst="rect">
+                      <a:avLst/>
+                    </a:prstGeom>
+                  </pic:spPr>
+                </pic:pic>
+              </a:graphicData>
+            </a:graphic>
+          </wp:inline>
+        </w:drawing>
+      </w:r>
+    </w:p>
+    <w:p>
+      <w:r>
+        <w:t>Code structure:</w:t>
+      </w:r>
+    </w:p>
+    <w:p>
+      <w:r>
+        <w:rPr>
+          <w:noProof/>
+        </w:rPr>
+        <w:lastRenderedPageBreak/>
+        <w:drawing>
+          <wp:inline distT="0" distB="0" distL="0" distR="0" wp14:anchorId="5026ABDF" wp14:editId="769C77A1">
+            <wp:extent cx="5210175" cy="3028950"/>
+            <wp:effectExtent l="0" t="0" r="9525" b="0"/>
+            <wp:docPr id="462205034" name="Picture 1"/>
+            <wp:cNvGraphicFramePr>
+              <a:graphicFrameLocks xmlns:a="http://schemas.openxmlformats.org/drawingml/2006/main" noChangeAspect="1"/>
+            </wp:cNvGraphicFramePr>
+            <a:graphic xmlns:a="http://schemas.openxmlformats.org/drawingml/2006/main">
+              <a:graphicData uri="http://schemas.openxmlformats.org/drawingml/2006/picture">
+                <pic:pic xmlns:pic="http://schemas.openxmlformats.org/drawingml/2006/picture">
+                  <pic:nvPicPr>
+                    <pic:cNvPr id="462205034" name=""/>
+                    <pic:cNvPicPr/>
+                  </pic:nvPicPr>
+                  <pic:blipFill>
+                    <a:blip r:embed="rId19"/>
+                    <a:stretch>
+                      <a:fillRect/>
+                    </a:stretch>
+                  </pic:blipFill>
+                  <pic:spPr>
+                    <a:xfrm>
+                      <a:off x="0" y="0"/>
+                      <a:ext cx="5210175" cy="3028950"/>
+                    </a:xfrm>
+                    <a:prstGeom prst="rect">
+                      <a:avLst/>
+                    </a:prstGeom>
+                  </pic:spPr>
+                </pic:pic>
+              </a:graphicData>
+            </a:graphic>
+          </wp:inline>
+        </w:drawing>
+      </w:r>
+    </w:p>
+    <w:p>
+      <w:r>
+        <w:t>Testing:</w:t>
+      </w:r>
+    </w:p>
+    <w:p>
+      <w:r>
+        <w:rPr>
+          <w:noProof/>
+        </w:rPr>
+        <w:drawing>
+          <wp:inline distT="0" distB="0" distL="0" distR="0" wp14:anchorId="281A70DF" wp14:editId="57889B20">
+            <wp:extent cx="5731510" cy="899795"/>
+            <wp:effectExtent l="0" t="0" r="2540" b="0"/>
+            <wp:docPr id="2033826653" name="Picture 1"/>
+            <wp:cNvGraphicFramePr>
+              <a:graphicFrameLocks xmlns:a="http://schemas.openxmlformats.org/drawingml/2006/main" noChangeAspect="1"/>
+            </wp:cNvGraphicFramePr>
+            <a:graphic xmlns:a="http://schemas.openxmlformats.org/drawingml/2006/main">
+              <a:graphicData uri="http://schemas.openxmlformats.org/drawingml/2006/picture">
+                <pic:pic xmlns:pic="http://schemas.openxmlformats.org/drawingml/2006/picture">
+                  <pic:nvPicPr>
+                    <pic:cNvPr id="2033826653" name=""/>
+                    <pic:cNvPicPr/>
+                  </pic:nvPicPr>
+                  <pic:blipFill>
+                    <a:blip r:embed="rId20"/>
+                    <a:stretch>
+                      <a:fillRect/>
+                    </a:stretch>
+                  </pic:blipFill>
+                  <pic:spPr>
+                    <a:xfrm>
+                      <a:off x="0" y="0"/>
+                      <a:ext cx="5731510" cy="899795"/>
+                    </a:xfrm>
+                    <a:prstGeom prst="rect">
+                      <a:avLst/>
+                    </a:prstGeom>
+                  </pic:spPr>
+                </pic:pic>
+              </a:graphicData>
+            </a:graphic>
+          </wp:inline>
+        </w:drawing>
+      </w:r>
+    </w:p>
+    <w:p>
+      <w:pPr>
+        <w:pStyle w:val="Heading1"/>
+      </w:pPr>
+      <w:r>
+        <w:t xml:space="preserve">Topic </w:t>
+      </w:r>
+      <w:r>
+        <w:t>6</w:t>
+      </w:r>
+      <w:r>
+        <w:t xml:space="preserve"> - Mini Activity:</w:t>
+      </w:r>
+    </w:p>
+    <w:p>
+      <w:r>
+        <w:rPr>
+          <w:noProof/>
+        </w:rPr>
+        <w:drawing>
+          <wp:inline distT="0" distB="0" distL="0" distR="0" wp14:anchorId="785AFE90" wp14:editId="55E4C48F">
+            <wp:extent cx="5715000" cy="895350"/>
+            <wp:effectExtent l="0" t="0" r="0" b="0"/>
+            <wp:docPr id="2140821980" name="Picture 1"/>
+            <wp:cNvGraphicFramePr>
+              <a:graphicFrameLocks xmlns:a="http://schemas.openxmlformats.org/drawingml/2006/main" noChangeAspect="1"/>
+            </wp:cNvGraphicFramePr>
+            <a:graphic xmlns:a="http://schemas.openxmlformats.org/drawingml/2006/main">
+              <a:graphicData uri="http://schemas.openxmlformats.org/drawingml/2006/picture">
+                <pic:pic xmlns:pic="http://schemas.openxmlformats.org/drawingml/2006/picture">
+                  <pic:nvPicPr>
+                    <pic:cNvPr id="2140821980" name=""/>
+                    <pic:cNvPicPr/>
+                  </pic:nvPicPr>
+                  <pic:blipFill>
+                    <a:blip r:embed="rId21"/>
+                    <a:stretch>
+                      <a:fillRect/>
+                    </a:stretch>
+                  </pic:blipFill>
+                  <pic:spPr>
+                    <a:xfrm>
+                      <a:off x="0" y="0"/>
+                      <a:ext cx="5715000" cy="895350"/>
+                    </a:xfrm>
+                    <a:prstGeom prst="rect">
+                      <a:avLst/>
+                    </a:prstGeom>
+                  </pic:spPr>
+                </pic:pic>
+              </a:graphicData>
+            </a:graphic>
+          </wp:inline>
+        </w:drawing>
+      </w:r>
+    </w:p>
+    <w:p>
+      <w:r>
+        <w:t>Code structure:</w:t>
+      </w:r>
+    </w:p>
+    <w:p>
+      <w:r>
+        <w:rPr>
+          <w:noProof/>
+        </w:rPr>
+        <w:drawing>
+          <wp:inline distT="0" distB="0" distL="0" distR="0" wp14:anchorId="27C17AB4" wp14:editId="448D05AF">
+            <wp:extent cx="4448175" cy="2305050"/>
+            <wp:effectExtent l="0" t="0" r="9525" b="0"/>
+            <wp:docPr id="1327917668" name="Picture 1"/>
+            <wp:cNvGraphicFramePr>
+              <a:graphicFrameLocks xmlns:a="http://schemas.openxmlformats.org/drawingml/2006/main" noChangeAspect="1"/>
+            </wp:cNvGraphicFramePr>
+            <a:graphic xmlns:a="http://schemas.openxmlformats.org/drawingml/2006/main">
+              <a:graphicData uri="http://schemas.openxmlformats.org/drawingml/2006/picture">
+                <pic:pic xmlns:pic="http://schemas.openxmlformats.org/drawingml/2006/picture">
+                  <pic:nvPicPr>
+                    <pic:cNvPr id="1327917668" name=""/>
+                    <pic:cNvPicPr/>
+                  </pic:nvPicPr>
+                  <pic:blipFill>
+                    <a:blip r:embed="rId22"/>
+                    <a:stretch>
+                      <a:fillRect/>
+                    </a:stretch>
+                  </pic:blipFill>
+                  <pic:spPr>
+                    <a:xfrm>
+                      <a:off x="0" y="0"/>
+                      <a:ext cx="4448175" cy="2305050"/>
+                    </a:xfrm>
+                    <a:prstGeom prst="rect">
+                      <a:avLst/>
+                    </a:prstGeom>
+                  </pic:spPr>
+                </pic:pic>
+              </a:graphicData>
+            </a:graphic>
+          </wp:inline>
+        </w:drawing>
+      </w:r>
+    </w:p>
+    <w:p>
+      <w:r>
+        <w:lastRenderedPageBreak/>
+        <w:t>Testing:</w:t>
+      </w:r>
+    </w:p>
+    <w:p>
+      <w:r>
+        <w:rPr>
+          <w:noProof/>
+        </w:rPr>
+        <w:drawing>
+          <wp:inline distT="0" distB="0" distL="0" distR="0" wp14:anchorId="4D0C8978" wp14:editId="17550148">
+            <wp:extent cx="5731510" cy="509905"/>
+            <wp:effectExtent l="0" t="0" r="2540" b="4445"/>
+            <wp:docPr id="1442436808" name="Picture 1"/>
+            <wp:cNvGraphicFramePr>
+              <a:graphicFrameLocks xmlns:a="http://schemas.openxmlformats.org/drawingml/2006/main" noChangeAspect="1"/>
+            </wp:cNvGraphicFramePr>
+            <a:graphic xmlns:a="http://schemas.openxmlformats.org/drawingml/2006/main">
+              <a:graphicData uri="http://schemas.openxmlformats.org/drawingml/2006/picture">
+                <pic:pic xmlns:pic="http://schemas.openxmlformats.org/drawingml/2006/picture">
+                  <pic:nvPicPr>
+                    <pic:cNvPr id="1442436808" name=""/>
+                    <pic:cNvPicPr/>
+                  </pic:nvPicPr>
+                  <pic:blipFill>
+                    <a:blip r:embed="rId23"/>
+                    <a:stretch>
+                      <a:fillRect/>
+                    </a:stretch>
+                  </pic:blipFill>
+                  <pic:spPr>
+                    <a:xfrm>
+                      <a:off x="0" y="0"/>
+                      <a:ext cx="5731510" cy="509905"/>
+                    </a:xfrm>
+                    <a:prstGeom prst="rect">
+                      <a:avLst/>
+                    </a:prstGeom>
+                  </pic:spPr>
+                </pic:pic>
+              </a:graphicData>
+            </a:graphic>
+          </wp:inline>
+        </w:drawing>
+      </w:r>
+    </w:p>
+    <w:p>
+      <w:pPr>
+        <w:pStyle w:val="Heading1"/>
+      </w:pPr>
+      <w:r>
+        <w:t xml:space="preserve">Topic </w:t>
+      </w:r>
+      <w:r>
+        <w:t>7</w:t>
+      </w:r>
+      <w:r>
+        <w:t xml:space="preserve"> - Mini Activity:</w:t>
+      </w:r>
+    </w:p>
+    <w:p>
+      <w:r>
+        <w:rPr>
+          <w:noProof/>
+        </w:rPr>
+        <w:drawing>
+          <wp:inline distT="0" distB="0" distL="0" distR="0" wp14:anchorId="0C9764FD" wp14:editId="0CB57C69">
+            <wp:extent cx="5731510" cy="824865"/>
+            <wp:effectExtent l="0" t="0" r="2540" b="0"/>
+            <wp:docPr id="241862681" name="Picture 1"/>
+            <wp:cNvGraphicFramePr>
+              <a:graphicFrameLocks xmlns:a="http://schemas.openxmlformats.org/drawingml/2006/main" noChangeAspect="1"/>
+            </wp:cNvGraphicFramePr>
+            <a:graphic xmlns:a="http://schemas.openxmlformats.org/drawingml/2006/main">
+              <a:graphicData uri="http://schemas.openxmlformats.org/drawingml/2006/picture">
+                <pic:pic xmlns:pic="http://schemas.openxmlformats.org/drawingml/2006/picture">
+                  <pic:nvPicPr>
+                    <pic:cNvPr id="241862681" name=""/>
+                    <pic:cNvPicPr/>
+                  </pic:nvPicPr>
+                  <pic:blipFill>
+                    <a:blip r:embed="rId24"/>
+                    <a:stretch>
+                      <a:fillRect/>
+                    </a:stretch>
+                  </pic:blipFill>
+                  <pic:spPr>
+                    <a:xfrm>
+                      <a:off x="0" y="0"/>
+                      <a:ext cx="5731510" cy="824865"/>
+                    </a:xfrm>
+                    <a:prstGeom prst="rect">
+                      <a:avLst/>
+                    </a:prstGeom>
+                  </pic:spPr>
+                </pic:pic>
+              </a:graphicData>
+            </a:graphic>
+          </wp:inline>
+        </w:drawing>
+      </w:r>
+    </w:p>
+    <w:p>
+      <w:r>
+        <w:t>Code structure:</w:t>
+      </w:r>
+    </w:p>
+    <w:p>
+      <w:r>
+        <w:rPr>
+          <w:noProof/>
+        </w:rPr>
+        <w:drawing>
+          <wp:inline distT="0" distB="0" distL="0" distR="0" wp14:anchorId="76D850B1" wp14:editId="3BEBFA28">
+            <wp:extent cx="5731510" cy="1953260"/>
+            <wp:effectExtent l="0" t="0" r="2540" b="8890"/>
+            <wp:docPr id="580399196" name="Picture 1"/>
+            <wp:cNvGraphicFramePr>
+              <a:graphicFrameLocks xmlns:a="http://schemas.openxmlformats.org/drawingml/2006/main" noChangeAspect="1"/>
+            </wp:cNvGraphicFramePr>
+            <a:graphic xmlns:a="http://schemas.openxmlformats.org/drawingml/2006/main">
+              <a:graphicData uri="http://schemas.openxmlformats.org/drawingml/2006/picture">
+                <pic:pic xmlns:pic="http://schemas.openxmlformats.org/drawingml/2006/picture">
+                  <pic:nvPicPr>
+                    <pic:cNvPr id="580399196" name=""/>
+                    <pic:cNvPicPr/>
+                  </pic:nvPicPr>
+                  <pic:blipFill>
+                    <a:blip r:embed="rId25"/>
+                    <a:stretch>
+                      <a:fillRect/>
+                    </a:stretch>
+                  </pic:blipFill>
+                  <pic:spPr>
+                    <a:xfrm>
+                      <a:off x="0" y="0"/>
+                      <a:ext cx="5731510" cy="1953260"/>
+                    </a:xfrm>
+                    <a:prstGeom prst="rect">
+                      <a:avLst/>
+                    </a:prstGeom>
+                  </pic:spPr>
+                </pic:pic>
+              </a:graphicData>
+            </a:graphic>
+          </wp:inline>
+        </w:drawing>
+      </w:r>
+    </w:p>
+    <w:p>
+      <w:r>
+        <w:t>Testing:</w:t>
+      </w:r>
+    </w:p>
+    <w:p>
+      <w:r>
+        <w:rPr>
+          <w:noProof/>
+        </w:rPr>
+        <w:drawing>
+          <wp:inline distT="0" distB="0" distL="0" distR="0" wp14:anchorId="5F0DE7D3" wp14:editId="1DE659BC">
+            <wp:extent cx="5731510" cy="1682750"/>
+            <wp:effectExtent l="0" t="0" r="2540" b="0"/>
+            <wp:docPr id="722168901" name="Picture 1"/>
+            <wp:cNvGraphicFramePr>
+              <a:graphicFrameLocks xmlns:a="http://schemas.openxmlformats.org/drawingml/2006/main" noChangeAspect="1"/>
+            </wp:cNvGraphicFramePr>
+            <a:graphic xmlns:a="http://schemas.openxmlformats.org/drawingml/2006/main">
+              <a:graphicData uri="http://schemas.openxmlformats.org/drawingml/2006/picture">
+                <pic:pic xmlns:pic="http://schemas.openxmlformats.org/drawingml/2006/picture">
+                  <pic:nvPicPr>
+                    <pic:cNvPr id="722168901" name=""/>
+                    <pic:cNvPicPr/>
+                  </pic:nvPicPr>
+                  <pic:blipFill>
+                    <a:blip r:embed="rId26"/>
+                    <a:stretch>
+                      <a:fillRect/>
+                    </a:stretch>
+                  </pic:blipFill>
+                  <pic:spPr>
+                    <a:xfrm>
+                      <a:off x="0" y="0"/>
+                      <a:ext cx="5731510" cy="1682750"/>
+                    </a:xfrm>
+                    <a:prstGeom prst="rect">
+                      <a:avLst/>
+                    </a:prstGeom>
+                  </pic:spPr>
+                </pic:pic>
+              </a:graphicData>
+            </a:graphic>
+          </wp:inline>
+        </w:drawing>
+      </w:r>
+    </w:p>
+    <w:p>
+      <w:pPr>
+        <w:pStyle w:val="Heading1"/>
+      </w:pPr>
+      <w:r>
+        <w:t xml:space="preserve">Topic </w:t>
+      </w:r>
+      <w:r>
+        <w:t>8</w:t>
+      </w:r>
+      <w:r>
+        <w:t xml:space="preserve"> - Mini Activity:</w:t>
+      </w:r>
+    </w:p>
+    <w:p>
+      <w:r>
+        <w:rPr>
+          <w:noProof/>
+        </w:rPr>
+        <w:drawing>
+          <wp:inline distT="0" distB="0" distL="0" distR="0" wp14:anchorId="6FD0D1D8" wp14:editId="390F36FE">
+            <wp:extent cx="5153025" cy="638175"/>
+            <wp:effectExtent l="0" t="0" r="9525" b="9525"/>
+            <wp:docPr id="2051833940" name="Picture 1"/>
+            <wp:cNvGraphicFramePr>
+              <a:graphicFrameLocks xmlns:a="http://schemas.openxmlformats.org/drawingml/2006/main" noChangeAspect="1"/>
+            </wp:cNvGraphicFramePr>
+            <a:graphic xmlns:a="http://schemas.openxmlformats.org/drawingml/2006/main">
+              <a:graphicData uri="http://schemas.openxmlformats.org/drawingml/2006/picture">
+                <pic:pic xmlns:pic="http://schemas.openxmlformats.org/drawingml/2006/picture">
+                  <pic:nvPicPr>
+                    <pic:cNvPr id="2051833940" name=""/>
+                    <pic:cNvPicPr/>
+                  </pic:nvPicPr>
+                  <pic:blipFill>
+                    <a:blip r:embed="rId27"/>
+                    <a:stretch>
+                      <a:fillRect/>
+                    </a:stretch>
+                  </pic:blipFill>
+                  <pic:spPr>
+                    <a:xfrm>
+                      <a:off x="0" y="0"/>
+                      <a:ext cx="5153025" cy="638175"/>
+                    </a:xfrm>
+                    <a:prstGeom prst="rect">
+                      <a:avLst/>
+                    </a:prstGeom>
+                  </pic:spPr>
+                </pic:pic>
+              </a:graphicData>
+            </a:graphic>
+          </wp:inline>
+        </w:drawing>
+      </w:r>
+    </w:p>
+    <w:p>
+      <w:r>
+        <w:t>Code structure:</w:t>
+      </w:r>
+    </w:p>
+    <w:p>
+      <w:r>
+        <w:rPr>
+          <w:noProof/>
+        </w:rPr>
+        <w:lastRenderedPageBreak/>
+        <w:drawing>
+          <wp:inline distT="0" distB="0" distL="0" distR="0" wp14:anchorId="106980FC" wp14:editId="3A86026A">
+            <wp:extent cx="5514975" cy="3438525"/>
+            <wp:effectExtent l="0" t="0" r="9525" b="9525"/>
+            <wp:docPr id="1046898354" name="Picture 1"/>
+            <wp:cNvGraphicFramePr>
+              <a:graphicFrameLocks xmlns:a="http://schemas.openxmlformats.org/drawingml/2006/main" noChangeAspect="1"/>
+            </wp:cNvGraphicFramePr>
+            <a:graphic xmlns:a="http://schemas.openxmlformats.org/drawingml/2006/main">
+              <a:graphicData uri="http://schemas.openxmlformats.org/drawingml/2006/picture">
+                <pic:pic xmlns:pic="http://schemas.openxmlformats.org/drawingml/2006/picture">
+                  <pic:nvPicPr>
+                    <pic:cNvPr id="1046898354" name=""/>
+                    <pic:cNvPicPr/>
+                  </pic:nvPicPr>
+                  <pic:blipFill>
+                    <a:blip r:embed="rId28"/>
+                    <a:stretch>
+                      <a:fillRect/>
+                    </a:stretch>
+                  </pic:blipFill>
+                  <pic:spPr>
+                    <a:xfrm>
+                      <a:off x="0" y="0"/>
+                      <a:ext cx="5514975" cy="3438525"/>
+                    </a:xfrm>
+                    <a:prstGeom prst="rect">
+                      <a:avLst/>
+                    </a:prstGeom>
+                  </pic:spPr>
+                </pic:pic>
+              </a:graphicData>
+            </a:graphic>
+          </wp:inline>
+        </w:drawing>
+      </w:r>
+    </w:p>
+    <w:p>
+      <w:r>
+        <w:t>Testing:</w:t>
+      </w:r>
+    </w:p>
+    <w:p>
+      <w:r>
+        <w:rPr>
+          <w:noProof/>
+        </w:rPr>
+        <w:drawing>
+          <wp:inline distT="0" distB="0" distL="0" distR="0" wp14:anchorId="61A5C6C5" wp14:editId="23271910">
+            <wp:extent cx="5731510" cy="386080"/>
+            <wp:effectExtent l="0" t="0" r="2540" b="0"/>
+            <wp:docPr id="539105255" name="Picture 1"/>
+            <wp:cNvGraphicFramePr>
+              <a:graphicFrameLocks xmlns:a="http://schemas.openxmlformats.org/drawingml/2006/main" noChangeAspect="1"/>
+            </wp:cNvGraphicFramePr>
+            <a:graphic xmlns:a="http://schemas.openxmlformats.org/drawingml/2006/main">
+              <a:graphicData uri="http://schemas.openxmlformats.org/drawingml/2006/picture">
+                <pic:pic xmlns:pic="http://schemas.openxmlformats.org/drawingml/2006/picture">
+                  <pic:nvPicPr>
+                    <pic:cNvPr id="539105255" name=""/>
+                    <pic:cNvPicPr/>
+                  </pic:nvPicPr>
+                  <pic:blipFill>
+                    <a:blip r:embed="rId29"/>
+                    <a:stretch>
+                      <a:fillRect/>
+                    </a:stretch>
+                  </pic:blipFill>
+                  <pic:spPr>
+                    <a:xfrm>
+                      <a:off x="0" y="0"/>
+                      <a:ext cx="5731510" cy="386080"/>
+                    </a:xfrm>
+                    <a:prstGeom prst="rect">
+                      <a:avLst/>
+                    </a:prstGeom>
+                  </pic:spPr>
+                </pic:pic>
+              </a:graphicData>
+            </a:graphic>
+          </wp:inline>
+        </w:drawing>
+      </w:r>
+    </w:p>
+    <w:p>
+      <w:pPr>
+        <w:pStyle w:val="Heading1"/>
+      </w:pPr>
+      <w:r>
+        <w:t xml:space="preserve">Topic </w:t>
+      </w:r>
+      <w:r>
+        <w:t>9</w:t>
+      </w:r>
+      <w:r>
+        <w:t xml:space="preserve"> - Mini Activity:</w:t>
+      </w:r>
+    </w:p>
+    <w:p>
+      <w:r>
+        <w:rPr>
+          <w:noProof/>
+        </w:rPr>
+        <w:drawing>
+          <wp:inline distT="0" distB="0" distL="0" distR="0" wp14:anchorId="5E4D6F77" wp14:editId="7DFDC9D4">
+            <wp:extent cx="5731510" cy="811530"/>
+            <wp:effectExtent l="0" t="0" r="2540" b="7620"/>
+            <wp:docPr id="1362204716" name="Picture 1"/>
+            <wp:cNvGraphicFramePr>
+              <a:graphicFrameLocks xmlns:a="http://schemas.openxmlformats.org/drawingml/2006/main" noChangeAspect="1"/>
+            </wp:cNvGraphicFramePr>
+            <a:graphic xmlns:a="http://schemas.openxmlformats.org/drawingml/2006/main">
+              <a:graphicData uri="http://schemas.openxmlformats.org/drawingml/2006/picture">
+                <pic:pic xmlns:pic="http://schemas.openxmlformats.org/drawingml/2006/picture">
+                  <pic:nvPicPr>
+                    <pic:cNvPr id="1362204716" name=""/>
+                    <pic:cNvPicPr/>
+                  </pic:nvPicPr>
+                  <pic:blipFill>
+                    <a:blip r:embed="rId30"/>
+                    <a:stretch>
+                      <a:fillRect/>
+                    </a:stretch>
+                  </pic:blipFill>
+                  <pic:spPr>
+                    <a:xfrm>
+                      <a:off x="0" y="0"/>
+                      <a:ext cx="5731510" cy="811530"/>
+                    </a:xfrm>
+                    <a:prstGeom prst="rect">
+                      <a:avLst/>
+                    </a:prstGeom>
+                  </pic:spPr>
+                </pic:pic>
+              </a:graphicData>
+            </a:graphic>
+          </wp:inline>
+        </w:drawing>
+      </w:r>
+    </w:p>
+    <w:p>
+      <w:r>
+        <w:t>Code structure:</w:t>
+      </w:r>
+    </w:p>
+    <w:p>
+      <w:r>
+        <w:rPr>
+          <w:noProof/>
+        </w:rPr>
+        <w:drawing>
+          <wp:inline distT="0" distB="0" distL="0" distR="0" wp14:anchorId="6C93086D" wp14:editId="5FB7284B">
+            <wp:extent cx="5695950" cy="1695450"/>
+            <wp:effectExtent l="0" t="0" r="0" b="0"/>
+            <wp:docPr id="1890589797" name="Picture 1"/>
+            <wp:cNvGraphicFramePr>
+              <a:graphicFrameLocks xmlns:a="http://schemas.openxmlformats.org/drawingml/2006/main" noChangeAspect="1"/>
+            </wp:cNvGraphicFramePr>
+            <a:graphic xmlns:a="http://schemas.openxmlformats.org/drawingml/2006/main">
+              <a:graphicData uri="http://schemas.openxmlformats.org/drawingml/2006/picture">
+                <pic:pic xmlns:pic="http://schemas.openxmlformats.org/drawingml/2006/picture">
+                  <pic:nvPicPr>
+                    <pic:cNvPr id="1890589797" name=""/>
+                    <pic:cNvPicPr/>
+                  </pic:nvPicPr>
+                  <pic:blipFill>
+                    <a:blip r:embed="rId31"/>
+                    <a:stretch>
+                      <a:fillRect/>
+                    </a:stretch>
+                  </pic:blipFill>
+                  <pic:spPr>
+                    <a:xfrm>
+                      <a:off x="0" y="0"/>
+                      <a:ext cx="5695950" cy="1695450"/>
+                    </a:xfrm>
+                    <a:prstGeom prst="rect">
+                      <a:avLst/>
+                    </a:prstGeom>
+                  </pic:spPr>
+                </pic:pic>
+              </a:graphicData>
+            </a:graphic>
+          </wp:inline>
+        </w:drawing>
+      </w:r>
+    </w:p>
+    <w:p>
+      <w:r>
+        <w:t>Testing:</w:t>
+      </w:r>
+    </w:p>
+    <w:p>
+      <w:r>
+        <w:rPr>
+          <w:noProof/>
+        </w:rPr>
+        <w:lastRenderedPageBreak/>
+        <w:drawing>
+          <wp:inline distT="0" distB="0" distL="0" distR="0" wp14:anchorId="13A35FE9" wp14:editId="721B2EC3">
+            <wp:extent cx="5731510" cy="1997075"/>
+            <wp:effectExtent l="0" t="0" r="2540" b="3175"/>
+            <wp:docPr id="1891873817" name="Picture 1"/>
+            <wp:cNvGraphicFramePr>
+              <a:graphicFrameLocks xmlns:a="http://schemas.openxmlformats.org/drawingml/2006/main" noChangeAspect="1"/>
+            </wp:cNvGraphicFramePr>
+            <a:graphic xmlns:a="http://schemas.openxmlformats.org/drawingml/2006/main">
+              <a:graphicData uri="http://schemas.openxmlformats.org/drawingml/2006/picture">
+                <pic:pic xmlns:pic="http://schemas.openxmlformats.org/drawingml/2006/picture">
+                  <pic:nvPicPr>
+                    <pic:cNvPr id="1891873817" name=""/>
+                    <pic:cNvPicPr/>
+                  </pic:nvPicPr>
+                  <pic:blipFill>
+                    <a:blip r:embed="rId32"/>
+                    <a:stretch>
+                      <a:fillRect/>
+                    </a:stretch>
+                  </pic:blipFill>
+                  <pic:spPr>
+                    <a:xfrm>
+                      <a:off x="0" y="0"/>
+                      <a:ext cx="5731510" cy="1997075"/>
+                    </a:xfrm>
+                    <a:prstGeom prst="rect">
+                      <a:avLst/>
+                    </a:prstGeom>
+                  </pic:spPr>
+                </pic:pic>
+              </a:graphicData>
+            </a:graphic>
+          </wp:inline>
+        </w:drawing>
+      </w:r>
+    </w:p>
+    <w:p>
+      <w:r>
+        <w:t xml:space="preserve">Error occurred because we are trying to call the variable from </w:t>
+      </w:r>
+      <w:r>
+        <w:rPr>
+          <w:b/>
+          <w:bCs/>
+        </w:rPr>
+        <w:t>OUTSIDE</w:t>
+      </w:r>
+      <w:r>
+        <w:t xml:space="preserve"> of the function/block scope.</w:t>
+      </w:r>
+    </w:p>
+    <w:p>
+      <w:pPr>
+        <w:pStyle w:val="Heading1"/>
+      </w:pPr>
+      <w:r>
+        <w:t xml:space="preserve">Topic </w:t>
+      </w:r>
+      <w:r>
+        <w:t>10</w:t>
+      </w:r>
+      <w:r>
+        <w:t xml:space="preserve"> - Mini Activity:</w:t>
+      </w:r>
+    </w:p>
+    <w:p>
+      <w:r>
+        <w:rPr>
+          <w:noProof/>
+        </w:rPr>
+        <w:drawing>
+          <wp:inline distT="0" distB="0" distL="0" distR="0" wp14:anchorId="0DFC638A" wp14:editId="0EFE7508">
+            <wp:extent cx="5731510" cy="671830"/>
+            <wp:effectExtent l="0" t="0" r="2540" b="0"/>
+            <wp:docPr id="1550507795" name="Picture 1"/>
+            <wp:cNvGraphicFramePr>
+              <a:graphicFrameLocks xmlns:a="http://schemas.openxmlformats.org/drawingml/2006/main" noChangeAspect="1"/>
+            </wp:cNvGraphicFramePr>
+            <a:graphic xmlns:a="http://schemas.openxmlformats.org/drawingml/2006/main">
+              <a:graphicData uri="http://schemas.openxmlformats.org/drawingml/2006/picture">
+                <pic:pic xmlns:pic="http://schemas.openxmlformats.org/drawingml/2006/picture">
+                  <pic:nvPicPr>
+                    <pic:cNvPr id="1550507795" name=""/>
+                    <pic:cNvPicPr/>
+                  </pic:nvPicPr>
+                  <pic:blipFill>
+                    <a:blip r:embed="rId33"/>
+                    <a:stretch>
+                      <a:fillRect/>
+                    </a:stretch>
+                  </pic:blipFill>
+                  <pic:spPr>
+                    <a:xfrm>
+                      <a:off x="0" y="0"/>
+                      <a:ext cx="5731510" cy="671830"/>
+                    </a:xfrm>
+                    <a:prstGeom prst="rect">
+                      <a:avLst/>
+                    </a:prstGeom>
+                  </pic:spPr>
+                </pic:pic>
+              </a:graphicData>
+            </a:graphic>
+          </wp:inline>
+        </w:drawing>
+      </w:r>
+    </w:p>
+    <w:p>
+      <w:r>
+        <w:t>Code Snippet:</w:t>
+      </w:r>
+    </w:p>
+    <w:p>
+      <w:r>
+        <w:rPr>
+          <w:noProof/>
+        </w:rPr>
+        <w:drawing>
+          <wp:inline distT="0" distB="0" distL="0" distR="0" wp14:anchorId="06C610AD" wp14:editId="10A5CB6F">
+            <wp:extent cx="5731510" cy="2530475"/>
+            <wp:effectExtent l="0" t="0" r="2540" b="3175"/>
+            <wp:docPr id="1167432729" name="Picture 1"/>
+            <wp:cNvGraphicFramePr>
+              <a:graphicFrameLocks xmlns:a="http://schemas.openxmlformats.org/drawingml/2006/main" noChangeAspect="1"/>
+            </wp:cNvGraphicFramePr>
+            <a:graphic xmlns:a="http://schemas.openxmlformats.org/drawingml/2006/main">
+              <a:graphicData uri="http://schemas.openxmlformats.org/drawingml/2006/picture">
+                <pic:pic xmlns:pic="http://schemas.openxmlformats.org/drawingml/2006/picture">
+                  <pic:nvPicPr>
+                    <pic:cNvPr id="1167432729" name=""/>
+                    <pic:cNvPicPr/>
+                  </pic:nvPicPr>
+                  <pic:blipFill>
+                    <a:blip r:embed="rId34"/>
+                    <a:stretch>
+                      <a:fillRect/>
+                    </a:stretch>
+                  </pic:blipFill>
+                  <pic:spPr>
+                    <a:xfrm>
+                      <a:off x="0" y="0"/>
+                      <a:ext cx="5731510" cy="2530475"/>
+                    </a:xfrm>
+                    <a:prstGeom prst="rect">
+                      <a:avLst/>
+                    </a:prstGeom>
+                  </pic:spPr>
+                </pic:pic>
+              </a:graphicData>
+            </a:graphic>
+          </wp:inline>
+        </w:drawing>
+      </w:r>
+    </w:p>
+    <w:p>
+      <w:r>
+        <w:t>Testing:</w:t>
+      </w:r>
+    </w:p>
+    <w:p>
+      <w:r>
+        <w:rPr>
+          <w:noProof/>
+        </w:rPr>
+        <w:drawing>
+          <wp:inline distT="0" distB="0" distL="0" distR="0" wp14:anchorId="4F74181A" wp14:editId="1D514F4A">
+            <wp:extent cx="5731510" cy="777875"/>
+            <wp:effectExtent l="0" t="0" r="2540" b="3175"/>
+            <wp:docPr id="33430490" name="Picture 1"/>
+            <wp:cNvGraphicFramePr>
+              <a:graphicFrameLocks xmlns:a="http://schemas.openxmlformats.org/drawingml/2006/main" noChangeAspect="1"/>
+            </wp:cNvGraphicFramePr>
+            <a:graphic xmlns:a="http://schemas.openxmlformats.org/drawingml/2006/main">
+              <a:graphicData uri="http://schemas.openxmlformats.org/drawingml/2006/picture">
+                <pic:pic xmlns:pic="http://schemas.openxmlformats.org/drawingml/2006/picture">
+                  <pic:nvPicPr>
+                    <pic:cNvPr id="33430490" name=""/>
+                    <pic:cNvPicPr/>
+                  </pic:nvPicPr>
+                  <pic:blipFill>
+                    <a:blip r:embed="rId35"/>
+                    <a:stretch>
+                      <a:fillRect/>
+                    </a:stretch>
+                  </pic:blipFill>
+                  <pic:spPr>
+                    <a:xfrm>
+                      <a:off x="0" y="0"/>
+                      <a:ext cx="5731510" cy="777875"/>
+                    </a:xfrm>
+                    <a:prstGeom prst="rect">
+                      <a:avLst/>
+                    </a:prstGeom>
+                  </pic:spPr>
+                </pic:pic>
+              </a:graphicData>
+            </a:graphic>
+          </wp:inline>
+        </w:drawing>
+      </w:r>
+    </w:p>
     <w:sectPr>
       <w:pgSz w:w="11906" w:h="16838"/>
       <w:pgMar w:top="1440" w:right="1440" w:bottom="1440" w:left="1440" w:header="708" w:footer="708" w:gutter="0"/>

</xml_diff>